<commit_message>
Sections Based on frequncy EUT on Mesurement data
</commit_message>
<xml_diff>
--- a/datasheet_gen/word_templates/IEC-FRM-504_CE.docx
+++ b/datasheet_gen/word_templates/IEC-FRM-504_CE.docx
@@ -1159,6 +1159,89 @@
       </w:r>
     </w:p>
     <w:p>
+      <w:r>
+        <w:rPr>
+          <w:b/>
+        </w:rPr>
+        <w:t>Line:</w:t>
+      </w:r>
+    </w:p>
+    <w:p>
+      <w:r>
+        <w:t>{{ func_line }}</w:t>
+      </w:r>
+    </w:p>
+    <w:p>
+      <w:r>
+        <w:rPr>
+          <w:b/>
+        </w:rPr>
+        <w:t>Neutral:</w:t>
+      </w:r>
+    </w:p>
+    <w:p>
+      <w:r>
+        <w:t>{{ func_neutral }}</w:t>
+      </w:r>
+    </w:p>
+    <w:p>
+      <w:pPr>
+        <w:pStyle w:val="Heading2"/>
+        <w:numPr>
+          <w:ilvl w:val="1"/>
+          <w:numId w:val="6"/>
+        </w:numPr>
+        <w:spacing w:before="0"/>
+        <w:rPr>
+          <w:rFonts w:ascii="Arial" w:hAnsi="Arial" w:cs="Arial"/>
+          <w:b/>
+          <w:bCs/>
+          <w:color w:val="auto"/>
+          <w:sz w:val="22"/>
+          <w:szCs w:val="22"/>
+          <w:lang w:val="en-US"/>
+        </w:rPr>
+      </w:pPr>
+      <w:r>
+        <w:rPr>
+          <w:rFonts w:ascii="Arial" w:hAnsi="Arial" w:cs="Arial"/>
+          <w:b/>
+          <w:bCs/>
+          <w:color w:val="auto"/>
+          <w:sz w:val="22"/>
+          <w:szCs w:val="22"/>
+          <w:lang w:val="en-US"/>
+        </w:rPr>
+        <w:t>AMBIENT</w:t>
+      </w:r>
+    </w:p>
+    <w:p>
+      <w:r>
+        <w:rPr>
+          <w:b/>
+        </w:rPr>
+        <w:t>Line:</w:t>
+      </w:r>
+    </w:p>
+    <w:p>
+      <w:r>
+        <w:t>{{ ambient_line }}</w:t>
+      </w:r>
+    </w:p>
+    <w:p>
+      <w:r>
+        <w:rPr>
+          <w:b/>
+        </w:rPr>
+        <w:t>Neutral:</w:t>
+      </w:r>
+    </w:p>
+    <w:p>
+      <w:r>
+        <w:t>{{ ambient_neutral }}</w:t>
+      </w:r>
+    </w:p>
+    <w:p>
       <w:pPr>
         <w:rPr>
           <w:rFonts w:ascii="Arial" w:hAnsi="Arial" w:cs="Arial"/>
@@ -3024,11 +3107,24 @@
       </w:pPr>
     </w:p>
     <w:p>
+      <w:r>
+        <w:t>{%p for rec in measurement_records %}</w:t>
+      </w:r>
+    </w:p>
+    <w:p>
+      <w:r>
+        <w:rPr>
+          <w:b/>
+        </w:rPr>
+        <w:t>{{ rec.label }}</w:t>
+      </w:r>
+    </w:p>
+    <w:p>
       <w:pPr>
         <w:spacing w:before="0" w:after="0"/>
       </w:pPr>
       <w:r>
-        <w:t>{{ plot_line }}</w:t>
+        <w:t>{{ rec.plot_line }}</w:t>
       </w:r>
     </w:p>
     <w:p>
@@ -3697,7 +3793,7 @@
           <w:p>
             <w:r/>
             <w:r>
-              <w:t>{%tr for r in line_rows %}</w:t>
+              <w:t>{%tr for r in rec.line_rows %}</w:t>
             </w:r>
           </w:p>
         </w:tc>
@@ -3905,7 +4001,7 @@
         <w:spacing w:before="0" w:after="0"/>
       </w:pPr>
       <w:r>
-        <w:t>{{ plot_neutral }}</w:t>
+        <w:t>{{ rec.plot_neutral }}</w:t>
       </w:r>
     </w:p>
     <w:p>
@@ -4587,7 +4683,7 @@
           <w:p>
             <w:r/>
             <w:r>
-              <w:t>{%tr for r in neutral_rows %}</w:t>
+              <w:t>{%tr for r in rec.neutral_rows %}</w:t>
             </w:r>
           </w:p>
         </w:tc>
@@ -4780,6 +4876,11 @@
         </w:tc>
       </w:tr>
     </w:tbl>
+    <w:p>
+      <w:r>
+        <w:t>{%p endfor %}</w:t>
+      </w:r>
+    </w:p>
     <w:p>
       <w:pPr>
         <w:spacing w:after="0"/>

</xml_diff>

<commit_message>
5 out of 6 Fixes done
</commit_message>
<xml_diff>
--- a/datasheet_gen/word_templates/IEC-FRM-504_CE.docx
+++ b/datasheet_gen/word_templates/IEC-FRM-504_CE.docx
@@ -3144,283 +3144,19 @@
         </w:rPr>
       </w:pPr>
       <w:bookmarkStart w:id="134" w:name="_Toc225977162"/>
+      <w:proofErr w:type="spellStart"/>
+      <w:proofErr w:type="spellEnd"/>
+      <w:bookmarkEnd w:id="134"/>
       <w:r>
         <w:rPr>
-          <w:rFonts w:ascii="Arial" w:hAnsi="Arial" w:cs="Arial"/>
+          <w:rFonts w:ascii="Arial" w:hAnsi="Arial"/>
           <w:b/>
-          <w:bCs/>
           <w:i w:val="0"/>
-          <w:iCs w:val="0"/>
-          <w:color w:val="auto"/>
+          <w:color w:val="000000"/>
           <w:sz w:val="20"/>
-          <w:szCs w:val="20"/>
-        </w:rPr>
-        <w:t xml:space="preserve">Figure </w:t>
+        </w:rPr>
+        <w:t>{{ rec.line_caption }}</w:t>
       </w:r>
-      <w:r>
-        <w:rPr>
-          <w:rFonts w:ascii="Arial" w:hAnsi="Arial" w:cs="Arial"/>
-          <w:b/>
-          <w:bCs/>
-          <w:i w:val="0"/>
-          <w:iCs w:val="0"/>
-          <w:color w:val="auto"/>
-          <w:sz w:val="20"/>
-          <w:szCs w:val="20"/>
-        </w:rPr>
-        <w:fldChar w:fldCharType="begin"/>
-      </w:r>
-      <w:r>
-        <w:rPr>
-          <w:rFonts w:ascii="Arial" w:hAnsi="Arial" w:cs="Arial"/>
-          <w:b/>
-          <w:bCs/>
-          <w:i w:val="0"/>
-          <w:iCs w:val="0"/>
-          <w:color w:val="auto"/>
-          <w:sz w:val="20"/>
-          <w:szCs w:val="20"/>
-        </w:rPr>
-        <w:instrText xml:space="preserve"> SEQ Figure \* ARABIC </w:instrText>
-      </w:r>
-      <w:r>
-        <w:rPr>
-          <w:rFonts w:ascii="Arial" w:hAnsi="Arial" w:cs="Arial"/>
-          <w:b/>
-          <w:bCs/>
-          <w:i w:val="0"/>
-          <w:iCs w:val="0"/>
-          <w:color w:val="auto"/>
-          <w:sz w:val="20"/>
-          <w:szCs w:val="20"/>
-        </w:rPr>
-        <w:fldChar w:fldCharType="separate"/>
-      </w:r>
-      <w:r>
-        <w:rPr>
-          <w:rFonts w:ascii="Arial" w:hAnsi="Arial" w:cs="Arial"/>
-          <w:b/>
-          <w:bCs/>
-          <w:i w:val="0"/>
-          <w:iCs w:val="0"/>
-          <w:noProof/>
-          <w:color w:val="auto"/>
-          <w:sz w:val="20"/>
-          <w:szCs w:val="20"/>
-        </w:rPr>
-        <w:t>1</w:t>
-      </w:r>
-      <w:r>
-        <w:rPr>
-          <w:rFonts w:ascii="Arial" w:hAnsi="Arial" w:cs="Arial"/>
-          <w:b/>
-          <w:bCs/>
-          <w:i w:val="0"/>
-          <w:iCs w:val="0"/>
-          <w:color w:val="auto"/>
-          <w:sz w:val="20"/>
-          <w:szCs w:val="20"/>
-        </w:rPr>
-        <w:fldChar w:fldCharType="end"/>
-      </w:r>
-      <w:r>
-        <w:rPr>
-          <w:rFonts w:ascii="Arial" w:hAnsi="Arial" w:cs="Arial"/>
-          <w:b/>
-          <w:bCs/>
-          <w:i w:val="0"/>
-          <w:iCs w:val="0"/>
-          <w:color w:val="auto"/>
-          <w:sz w:val="20"/>
-          <w:szCs w:val="20"/>
-        </w:rPr>
-        <w:t xml:space="preserve">: </w:t>
-      </w:r>
-      <w:r>
-        <w:rPr>
-          <w:rFonts w:ascii="Arial" w:hAnsi="Arial" w:cs="Arial"/>
-          <w:b/>
-          <w:bCs/>
-          <w:i w:val="0"/>
-          <w:iCs w:val="0"/>
-          <w:color w:val="auto"/>
-          <w:sz w:val="20"/>
-          <w:szCs w:val="20"/>
-        </w:rPr>
-        <w:t>C</w:t>
-      </w:r>
-      <w:r>
-        <w:rPr>
-          <w:rFonts w:ascii="Arial" w:hAnsi="Arial" w:cs="Arial"/>
-          <w:b/>
-          <w:bCs/>
-          <w:i w:val="0"/>
-          <w:iCs w:val="0"/>
-          <w:color w:val="auto"/>
-          <w:sz w:val="20"/>
-          <w:szCs w:val="20"/>
-        </w:rPr>
-        <w:t>E</w:t>
-      </w:r>
-      <w:r>
-        <w:rPr>
-          <w:rFonts w:ascii="Arial" w:hAnsi="Arial" w:cs="Arial"/>
-          <w:b/>
-          <w:bCs/>
-          <w:i w:val="0"/>
-          <w:iCs w:val="0"/>
-          <w:color w:val="auto"/>
-          <w:sz w:val="20"/>
-          <w:szCs w:val="20"/>
-        </w:rPr>
-        <w:t xml:space="preserve"> </w:t>
-      </w:r>
-      <w:proofErr w:type="spellStart"/>
-      <w:r>
-        <w:rPr>
-          <w:rFonts w:ascii="Arial" w:hAnsi="Arial" w:cs="Arial"/>
-          <w:b/>
-          <w:bCs/>
-          <w:i w:val="0"/>
-          <w:iCs w:val="0"/>
-          <w:color w:val="auto"/>
-          <w:sz w:val="20"/>
-          <w:szCs w:val="20"/>
-        </w:rPr>
-        <w:t>plot_Line_</w:t>
-      </w:r>
-      <w:r>
-        <w:rPr>
-          <w:rFonts w:ascii="Arial" w:hAnsi="Arial" w:cs="Arial"/>
-          <w:b/>
-          <w:bCs/>
-          <w:i w:val="0"/>
-          <w:iCs w:val="0"/>
-          <w:color w:val="auto"/>
-          <w:sz w:val="20"/>
-          <w:szCs w:val="20"/>
-        </w:rPr>
-        <w:t>Quasi</w:t>
-      </w:r>
-      <w:proofErr w:type="spellEnd"/>
-      <w:r>
-        <w:rPr>
-          <w:rFonts w:ascii="Arial" w:hAnsi="Arial" w:cs="Arial"/>
-          <w:b/>
-          <w:bCs/>
-          <w:i w:val="0"/>
-          <w:iCs w:val="0"/>
-          <w:color w:val="auto"/>
-          <w:sz w:val="20"/>
-          <w:szCs w:val="20"/>
-        </w:rPr>
-        <w:t>-</w:t>
-      </w:r>
-      <w:r>
-        <w:rPr>
-          <w:rFonts w:ascii="Arial" w:hAnsi="Arial" w:cs="Arial"/>
-          <w:b/>
-          <w:bCs/>
-          <w:i w:val="0"/>
-          <w:iCs w:val="0"/>
-          <w:color w:val="auto"/>
-          <w:sz w:val="20"/>
-          <w:szCs w:val="20"/>
-        </w:rPr>
-        <w:t>peak</w:t>
-      </w:r>
-      <w:r>
-        <w:rPr>
-          <w:rFonts w:ascii="Arial" w:hAnsi="Arial" w:cs="Arial"/>
-          <w:b/>
-          <w:bCs/>
-          <w:i w:val="0"/>
-          <w:iCs w:val="0"/>
-          <w:color w:val="auto"/>
-          <w:sz w:val="20"/>
-          <w:szCs w:val="20"/>
-        </w:rPr>
-        <w:t xml:space="preserve"> &amp; </w:t>
-      </w:r>
-      <w:r>
-        <w:rPr>
-          <w:rFonts w:ascii="Arial" w:hAnsi="Arial" w:cs="Arial"/>
-          <w:b/>
-          <w:bCs/>
-          <w:i w:val="0"/>
-          <w:iCs w:val="0"/>
-          <w:color w:val="auto"/>
-          <w:sz w:val="20"/>
-          <w:szCs w:val="20"/>
-        </w:rPr>
-        <w:t>Average</w:t>
-      </w:r>
-      <w:r>
-        <w:rPr>
-          <w:rFonts w:ascii="Arial" w:hAnsi="Arial" w:cs="Arial"/>
-          <w:b/>
-          <w:bCs/>
-          <w:i w:val="0"/>
-          <w:iCs w:val="0"/>
-          <w:color w:val="auto"/>
-          <w:sz w:val="20"/>
-          <w:szCs w:val="20"/>
-        </w:rPr>
-        <w:t>_</w:t>
-      </w:r>
-      <w:r>
-        <w:rPr>
-          <w:rFonts w:ascii="Arial" w:hAnsi="Arial" w:cs="Arial"/>
-          <w:b/>
-          <w:bCs/>
-          <w:i w:val="0"/>
-          <w:iCs w:val="0"/>
-          <w:color w:val="auto"/>
-          <w:sz w:val="20"/>
-          <w:szCs w:val="20"/>
-        </w:rPr>
-        <w:t xml:space="preserve">0.15MHz </w:t>
-      </w:r>
-      <w:r>
-        <w:rPr>
-          <w:rFonts w:ascii="Arial" w:hAnsi="Arial" w:cs="Arial"/>
-          <w:b/>
-          <w:bCs/>
-          <w:i w:val="0"/>
-          <w:iCs w:val="0"/>
-          <w:color w:val="auto"/>
-          <w:sz w:val="20"/>
-          <w:szCs w:val="20"/>
-        </w:rPr>
-        <w:t>-</w:t>
-      </w:r>
-      <w:r>
-        <w:rPr>
-          <w:rFonts w:ascii="Arial" w:hAnsi="Arial" w:cs="Arial"/>
-          <w:b/>
-          <w:bCs/>
-          <w:i w:val="0"/>
-          <w:iCs w:val="0"/>
-          <w:color w:val="auto"/>
-          <w:sz w:val="20"/>
-          <w:szCs w:val="20"/>
-        </w:rPr>
-        <w:t xml:space="preserve"> </w:t>
-      </w:r>
-      <w:r>
-        <w:rPr>
-          <w:rFonts w:ascii="Arial" w:hAnsi="Arial" w:cs="Arial"/>
-          <w:b/>
-          <w:bCs/>
-          <w:i w:val="0"/>
-          <w:iCs w:val="0"/>
-          <w:color w:val="auto"/>
-          <w:sz w:val="20"/>
-          <w:szCs w:val="20"/>
-        </w:rPr>
-        <w:t>30MHz</w:t>
-      </w:r>
-      <w:bookmarkEnd w:id="134"/>
     </w:p>
     <w:p>
       <w:pPr>
@@ -4021,270 +3757,19 @@
         </w:rPr>
       </w:pPr>
       <w:bookmarkStart w:id="136" w:name="_Toc225977163"/>
+      <w:proofErr w:type="spellStart"/>
+      <w:proofErr w:type="spellEnd"/>
+      <w:bookmarkEnd w:id="136"/>
       <w:r>
         <w:rPr>
-          <w:rFonts w:ascii="Arial" w:hAnsi="Arial" w:cs="Arial"/>
+          <w:rFonts w:ascii="Arial" w:hAnsi="Arial"/>
           <w:b/>
-          <w:bCs/>
           <w:i w:val="0"/>
-          <w:iCs w:val="0"/>
-          <w:color w:val="auto"/>
+          <w:color w:val="000000"/>
           <w:sz w:val="20"/>
-          <w:szCs w:val="20"/>
-        </w:rPr>
-        <w:t xml:space="preserve">Figure </w:t>
+        </w:rPr>
+        <w:t>{{ rec.neutral_caption }}</w:t>
       </w:r>
-      <w:r>
-        <w:rPr>
-          <w:rFonts w:ascii="Arial" w:hAnsi="Arial" w:cs="Arial"/>
-          <w:b/>
-          <w:bCs/>
-          <w:i w:val="0"/>
-          <w:iCs w:val="0"/>
-          <w:color w:val="auto"/>
-          <w:sz w:val="20"/>
-          <w:szCs w:val="20"/>
-        </w:rPr>
-        <w:fldChar w:fldCharType="begin"/>
-      </w:r>
-      <w:r>
-        <w:rPr>
-          <w:rFonts w:ascii="Arial" w:hAnsi="Arial" w:cs="Arial"/>
-          <w:b/>
-          <w:bCs/>
-          <w:i w:val="0"/>
-          <w:iCs w:val="0"/>
-          <w:color w:val="auto"/>
-          <w:sz w:val="20"/>
-          <w:szCs w:val="20"/>
-        </w:rPr>
-        <w:instrText xml:space="preserve"> SEQ Figure \* ARABIC </w:instrText>
-      </w:r>
-      <w:r>
-        <w:rPr>
-          <w:rFonts w:ascii="Arial" w:hAnsi="Arial" w:cs="Arial"/>
-          <w:b/>
-          <w:bCs/>
-          <w:i w:val="0"/>
-          <w:iCs w:val="0"/>
-          <w:color w:val="auto"/>
-          <w:sz w:val="20"/>
-          <w:szCs w:val="20"/>
-        </w:rPr>
-        <w:fldChar w:fldCharType="separate"/>
-      </w:r>
-      <w:r>
-        <w:rPr>
-          <w:rFonts w:ascii="Arial" w:hAnsi="Arial" w:cs="Arial"/>
-          <w:b/>
-          <w:bCs/>
-          <w:i w:val="0"/>
-          <w:iCs w:val="0"/>
-          <w:noProof/>
-          <w:color w:val="auto"/>
-          <w:sz w:val="20"/>
-          <w:szCs w:val="20"/>
-        </w:rPr>
-        <w:t>2</w:t>
-      </w:r>
-      <w:r>
-        <w:rPr>
-          <w:rFonts w:ascii="Arial" w:hAnsi="Arial" w:cs="Arial"/>
-          <w:b/>
-          <w:bCs/>
-          <w:i w:val="0"/>
-          <w:iCs w:val="0"/>
-          <w:color w:val="auto"/>
-          <w:sz w:val="20"/>
-          <w:szCs w:val="20"/>
-        </w:rPr>
-        <w:fldChar w:fldCharType="end"/>
-      </w:r>
-      <w:r>
-        <w:rPr>
-          <w:rFonts w:ascii="Arial" w:hAnsi="Arial" w:cs="Arial"/>
-          <w:b/>
-          <w:bCs/>
-          <w:i w:val="0"/>
-          <w:iCs w:val="0"/>
-          <w:color w:val="auto"/>
-          <w:sz w:val="20"/>
-          <w:szCs w:val="20"/>
-        </w:rPr>
-        <w:t>: CE</w:t>
-      </w:r>
-      <w:r>
-        <w:rPr>
-          <w:rFonts w:ascii="Arial" w:hAnsi="Arial" w:cs="Arial"/>
-          <w:b/>
-          <w:bCs/>
-          <w:i w:val="0"/>
-          <w:iCs w:val="0"/>
-          <w:color w:val="auto"/>
-          <w:sz w:val="20"/>
-          <w:szCs w:val="20"/>
-        </w:rPr>
-        <w:t xml:space="preserve"> </w:t>
-      </w:r>
-      <w:proofErr w:type="spellStart"/>
-      <w:r>
-        <w:rPr>
-          <w:rFonts w:ascii="Arial" w:hAnsi="Arial" w:cs="Arial"/>
-          <w:b/>
-          <w:bCs/>
-          <w:i w:val="0"/>
-          <w:iCs w:val="0"/>
-          <w:color w:val="auto"/>
-          <w:sz w:val="20"/>
-          <w:szCs w:val="20"/>
-        </w:rPr>
-        <w:t>plot_</w:t>
-      </w:r>
-      <w:r>
-        <w:rPr>
-          <w:rFonts w:ascii="Arial" w:hAnsi="Arial" w:cs="Arial"/>
-          <w:b/>
-          <w:bCs/>
-          <w:i w:val="0"/>
-          <w:iCs w:val="0"/>
-          <w:color w:val="auto"/>
-          <w:sz w:val="20"/>
-          <w:szCs w:val="20"/>
-        </w:rPr>
-        <w:t>Neutral</w:t>
-      </w:r>
-      <w:r>
-        <w:rPr>
-          <w:rFonts w:ascii="Arial" w:hAnsi="Arial" w:cs="Arial"/>
-          <w:b/>
-          <w:bCs/>
-          <w:i w:val="0"/>
-          <w:iCs w:val="0"/>
-          <w:color w:val="auto"/>
-          <w:sz w:val="20"/>
-          <w:szCs w:val="20"/>
-        </w:rPr>
-        <w:t>_</w:t>
-      </w:r>
-      <w:r>
-        <w:rPr>
-          <w:rFonts w:ascii="Arial" w:hAnsi="Arial" w:cs="Arial"/>
-          <w:b/>
-          <w:bCs/>
-          <w:i w:val="0"/>
-          <w:iCs w:val="0"/>
-          <w:color w:val="auto"/>
-          <w:sz w:val="20"/>
-          <w:szCs w:val="20"/>
-        </w:rPr>
-        <w:t>Quasi</w:t>
-      </w:r>
-      <w:proofErr w:type="spellEnd"/>
-      <w:r>
-        <w:rPr>
-          <w:rFonts w:ascii="Arial" w:hAnsi="Arial" w:cs="Arial"/>
-          <w:b/>
-          <w:bCs/>
-          <w:i w:val="0"/>
-          <w:iCs w:val="0"/>
-          <w:color w:val="auto"/>
-          <w:sz w:val="20"/>
-          <w:szCs w:val="20"/>
-        </w:rPr>
-        <w:t>-</w:t>
-      </w:r>
-      <w:r>
-        <w:rPr>
-          <w:rFonts w:ascii="Arial" w:hAnsi="Arial" w:cs="Arial"/>
-          <w:b/>
-          <w:bCs/>
-          <w:i w:val="0"/>
-          <w:iCs w:val="0"/>
-          <w:color w:val="auto"/>
-          <w:sz w:val="20"/>
-          <w:szCs w:val="20"/>
-        </w:rPr>
-        <w:t>peak</w:t>
-      </w:r>
-      <w:r>
-        <w:rPr>
-          <w:rFonts w:ascii="Arial" w:hAnsi="Arial" w:cs="Arial"/>
-          <w:b/>
-          <w:bCs/>
-          <w:i w:val="0"/>
-          <w:iCs w:val="0"/>
-          <w:color w:val="auto"/>
-          <w:sz w:val="20"/>
-          <w:szCs w:val="20"/>
-        </w:rPr>
-        <w:t xml:space="preserve"> &amp; </w:t>
-      </w:r>
-      <w:r>
-        <w:rPr>
-          <w:rFonts w:ascii="Arial" w:hAnsi="Arial" w:cs="Arial"/>
-          <w:b/>
-          <w:bCs/>
-          <w:i w:val="0"/>
-          <w:iCs w:val="0"/>
-          <w:color w:val="auto"/>
-          <w:sz w:val="20"/>
-          <w:szCs w:val="20"/>
-        </w:rPr>
-        <w:t>Average</w:t>
-      </w:r>
-      <w:r>
-        <w:rPr>
-          <w:rFonts w:ascii="Arial" w:hAnsi="Arial" w:cs="Arial"/>
-          <w:b/>
-          <w:bCs/>
-          <w:i w:val="0"/>
-          <w:iCs w:val="0"/>
-          <w:color w:val="auto"/>
-          <w:sz w:val="20"/>
-          <w:szCs w:val="20"/>
-        </w:rPr>
-        <w:t>_</w:t>
-      </w:r>
-      <w:r>
-        <w:rPr>
-          <w:rFonts w:ascii="Arial" w:hAnsi="Arial" w:cs="Arial"/>
-          <w:b/>
-          <w:bCs/>
-          <w:i w:val="0"/>
-          <w:iCs w:val="0"/>
-          <w:color w:val="auto"/>
-          <w:sz w:val="20"/>
-          <w:szCs w:val="20"/>
-        </w:rPr>
-        <w:t xml:space="preserve">0.15MHz </w:t>
-      </w:r>
-      <w:r>
-        <w:rPr>
-          <w:rFonts w:ascii="Arial" w:hAnsi="Arial" w:cs="Arial"/>
-          <w:b/>
-          <w:bCs/>
-          <w:i w:val="0"/>
-          <w:iCs w:val="0"/>
-          <w:color w:val="auto"/>
-          <w:sz w:val="20"/>
-          <w:szCs w:val="20"/>
-        </w:rPr>
-        <w:t>-</w:t>
-      </w:r>
-      <w:r>
-        <w:rPr>
-          <w:rFonts w:ascii="Arial" w:hAnsi="Arial" w:cs="Arial"/>
-          <w:b/>
-          <w:bCs/>
-          <w:i w:val="0"/>
-          <w:iCs w:val="0"/>
-          <w:color w:val="auto"/>
-          <w:sz w:val="20"/>
-          <w:szCs w:val="20"/>
-        </w:rPr>
-        <w:t xml:space="preserve"> 30MHz</w:t>
-      </w:r>
-      <w:bookmarkEnd w:id="136"/>
     </w:p>
     <w:p>
       <w:pPr>
@@ -4959,214 +4444,19 @@
         </w:rPr>
       </w:pPr>
       <w:bookmarkStart w:id="139" w:name="_Toc225977172"/>
+      <w:proofErr w:type="spellStart"/>
+      <w:proofErr w:type="spellEnd"/>
+      <w:bookmarkEnd w:id="139"/>
       <w:r>
         <w:rPr>
-          <w:rStyle w:val="Hyperlink"/>
-          <w:rFonts w:ascii="Arial" w:hAnsi="Arial" w:cs="Arial"/>
+          <w:rFonts w:ascii="Arial" w:hAnsi="Arial"/>
           <w:b/>
-          <w:bCs/>
           <w:i w:val="0"/>
-          <w:iCs w:val="0"/>
-          <w:noProof/>
-          <w:color w:val="auto"/>
+          <w:color w:val="000000"/>
           <w:sz w:val="20"/>
-          <w:szCs w:val="20"/>
-          <w:u w:val="none"/>
-        </w:rPr>
-        <w:t>Photo</w:t>
+        </w:rPr>
+        <w:t>{{ photo_caption }}</w:t>
       </w:r>
-      <w:r>
-        <w:rPr>
-          <w:rStyle w:val="Hyperlink"/>
-          <w:rFonts w:ascii="Arial" w:hAnsi="Arial" w:cs="Arial"/>
-          <w:b/>
-          <w:bCs/>
-          <w:i w:val="0"/>
-          <w:iCs w:val="0"/>
-          <w:noProof/>
-          <w:color w:val="auto"/>
-          <w:u w:val="none"/>
-        </w:rPr>
-        <w:t xml:space="preserve"> </w:t>
-      </w:r>
-      <w:r>
-        <w:rPr>
-          <w:rStyle w:val="Hyperlink"/>
-          <w:rFonts w:ascii="Arial" w:hAnsi="Arial" w:cs="Arial"/>
-          <w:b/>
-          <w:bCs/>
-          <w:i w:val="0"/>
-          <w:iCs w:val="0"/>
-          <w:noProof/>
-          <w:color w:val="auto"/>
-          <w:sz w:val="20"/>
-          <w:szCs w:val="20"/>
-          <w:u w:val="none"/>
-        </w:rPr>
-        <w:fldChar w:fldCharType="begin"/>
-      </w:r>
-      <w:r>
-        <w:rPr>
-          <w:rStyle w:val="Hyperlink"/>
-          <w:rFonts w:ascii="Arial" w:hAnsi="Arial" w:cs="Arial"/>
-          <w:b/>
-          <w:bCs/>
-          <w:i w:val="0"/>
-          <w:iCs w:val="0"/>
-          <w:noProof/>
-          <w:color w:val="auto"/>
-          <w:sz w:val="20"/>
-          <w:szCs w:val="20"/>
-          <w:u w:val="none"/>
-        </w:rPr>
-        <w:instrText xml:space="preserve"> SEQ Photo \* ARABIC </w:instrText>
-      </w:r>
-      <w:r>
-        <w:rPr>
-          <w:rStyle w:val="Hyperlink"/>
-          <w:rFonts w:ascii="Arial" w:hAnsi="Arial" w:cs="Arial"/>
-          <w:b/>
-          <w:bCs/>
-          <w:i w:val="0"/>
-          <w:iCs w:val="0"/>
-          <w:noProof/>
-          <w:color w:val="auto"/>
-          <w:sz w:val="20"/>
-          <w:szCs w:val="20"/>
-          <w:u w:val="none"/>
-        </w:rPr>
-        <w:fldChar w:fldCharType="separate"/>
-      </w:r>
-      <w:r>
-        <w:rPr>
-          <w:rStyle w:val="Hyperlink"/>
-          <w:rFonts w:ascii="Arial" w:hAnsi="Arial" w:cs="Arial"/>
-          <w:b/>
-          <w:bCs/>
-          <w:i w:val="0"/>
-          <w:iCs w:val="0"/>
-          <w:noProof/>
-          <w:color w:val="auto"/>
-          <w:sz w:val="20"/>
-          <w:szCs w:val="20"/>
-          <w:u w:val="none"/>
-        </w:rPr>
-        <w:t>1</w:t>
-      </w:r>
-      <w:r>
-        <w:rPr>
-          <w:rStyle w:val="Hyperlink"/>
-          <w:rFonts w:ascii="Arial" w:hAnsi="Arial" w:cs="Arial"/>
-          <w:b/>
-          <w:bCs/>
-          <w:i w:val="0"/>
-          <w:iCs w:val="0"/>
-          <w:noProof/>
-          <w:color w:val="auto"/>
-          <w:sz w:val="20"/>
-          <w:szCs w:val="20"/>
-          <w:u w:val="none"/>
-        </w:rPr>
-        <w:fldChar w:fldCharType="end"/>
-      </w:r>
-      <w:r>
-        <w:rPr>
-          <w:rStyle w:val="Hyperlink"/>
-          <w:rFonts w:ascii="Arial" w:hAnsi="Arial" w:cs="Arial"/>
-          <w:b/>
-          <w:bCs/>
-          <w:i w:val="0"/>
-          <w:iCs w:val="0"/>
-          <w:noProof/>
-          <w:color w:val="auto"/>
-          <w:sz w:val="20"/>
-          <w:szCs w:val="20"/>
-          <w:u w:val="none"/>
-        </w:rPr>
-        <w:t>:</w:t>
-      </w:r>
-      <w:r>
-        <w:rPr>
-          <w:rStyle w:val="Hyperlink"/>
-          <w:rFonts w:ascii="Arial" w:hAnsi="Arial" w:cs="Arial"/>
-          <w:b/>
-          <w:bCs/>
-          <w:noProof/>
-          <w:color w:val="auto"/>
-          <w:sz w:val="20"/>
-          <w:szCs w:val="20"/>
-          <w:u w:val="none"/>
-        </w:rPr>
-        <w:t xml:space="preserve"> </w:t>
-      </w:r>
-      <w:r>
-        <w:rPr>
-          <w:rFonts w:ascii="Arial" w:hAnsi="Arial" w:cs="Arial"/>
-          <w:b/>
-          <w:bCs/>
-          <w:i w:val="0"/>
-          <w:iCs w:val="0"/>
-          <w:color w:val="auto"/>
-          <w:sz w:val="20"/>
-          <w:szCs w:val="20"/>
-        </w:rPr>
-        <w:t xml:space="preserve">CE test </w:t>
-      </w:r>
-      <w:proofErr w:type="spellStart"/>
-      <w:r>
-        <w:rPr>
-          <w:rFonts w:ascii="Arial" w:hAnsi="Arial" w:cs="Arial"/>
-          <w:b/>
-          <w:bCs/>
-          <w:i w:val="0"/>
-          <w:iCs w:val="0"/>
-          <w:color w:val="auto"/>
-          <w:sz w:val="20"/>
-          <w:szCs w:val="20"/>
-        </w:rPr>
-        <w:t>setup</w:t>
-      </w:r>
-      <w:r>
-        <w:rPr>
-          <w:rFonts w:ascii="Arial" w:hAnsi="Arial" w:cs="Arial"/>
-          <w:b/>
-          <w:bCs/>
-          <w:i w:val="0"/>
-          <w:iCs w:val="0"/>
-          <w:color w:val="auto"/>
-          <w:sz w:val="20"/>
-          <w:szCs w:val="20"/>
-        </w:rPr>
-        <w:t>_</w:t>
-      </w:r>
-      <w:r>
-        <w:rPr>
-          <w:rFonts w:ascii="Arial" w:hAnsi="Arial" w:cs="Arial"/>
-          <w:b/>
-          <w:bCs/>
-          <w:i w:val="0"/>
-          <w:iCs w:val="0"/>
-          <w:color w:val="auto"/>
-          <w:sz w:val="20"/>
-          <w:szCs w:val="20"/>
-        </w:rPr>
-        <w:t>Power</w:t>
-      </w:r>
-      <w:proofErr w:type="spellEnd"/>
-      <w:r>
-        <w:rPr>
-          <w:rFonts w:ascii="Arial" w:hAnsi="Arial" w:cs="Arial"/>
-          <w:b/>
-          <w:bCs/>
-          <w:i w:val="0"/>
-          <w:iCs w:val="0"/>
-          <w:color w:val="auto"/>
-          <w:sz w:val="20"/>
-          <w:szCs w:val="20"/>
-        </w:rPr>
-        <w:t xml:space="preserve"> Port</w:t>
-      </w:r>
-      <w:bookmarkEnd w:id="139"/>
     </w:p>
     <w:p>
       <w:pPr>

</xml_diff>